<commit_message>
mui day1 and updating cv
</commit_message>
<xml_diff>
--- a/Yousef Mohamed Back-end CV.docx
+++ b/Yousef Mohamed Back-end CV.docx
@@ -43,61 +43,225 @@
     </w:p>
     <w:p>
       <w:pPr>
+        <w:spacing w:after="113" w:afterLines="31" w:afterAutospacing="0" w:line="240" w:lineRule="auto"/>
+        <w:jc w:val="center"/>
+        <w:rPr>
+          <w:rFonts w:hint="default"/>
+          <w:sz w:val="28"/>
+          <w:szCs w:val="28"/>
+          <w:lang w:val="en-US"/>
+        </w:rPr>
+      </w:pPr>
+      <w:r>
+        <w:rPr>
+          <w:rFonts w:hint="default"/>
+          <w:sz w:val="28"/>
+          <w:szCs w:val="28"/>
+          <w:lang w:val="en-US"/>
+        </w:rPr>
+        <w:t>Software Engineer (Full-Stack MEARN)</w:t>
+      </w:r>
+    </w:p>
+    <w:p>
+      <w:pPr>
+        <w:spacing w:beforeAutospacing="0" w:line="240" w:lineRule="auto"/>
+        <w:jc w:val="center"/>
+        <w:rPr>
+          <w:rFonts w:hint="default"/>
+          <w:lang w:val="en-US"/>
+        </w:rPr>
+      </w:pPr>
+      <w:r>
+        <w:rPr>
+          <w:rFonts w:hint="default"/>
+          <w:b/>
+          <w:bCs/>
+          <w:lang w:val="en-US"/>
+        </w:rPr>
+        <w:t>Address</w:t>
+      </w:r>
+      <w:r>
+        <w:rPr>
+          <w:rFonts w:hint="default"/>
+          <w:lang w:val="en-US"/>
+        </w:rPr>
+        <w:t xml:space="preserve">: El-Mansoura, Egypt </w:t>
+      </w:r>
+      <w:r>
+        <w:rPr>
+          <w:rFonts w:hint="default"/>
+          <w:b/>
+          <w:bCs/>
+          <w:lang w:val="en-US"/>
+        </w:rPr>
+        <w:t>|</w:t>
+      </w:r>
+      <w:r>
+        <w:rPr>
+          <w:rFonts w:hint="default"/>
+          <w:lang w:val="en-US"/>
+        </w:rPr>
+        <w:t xml:space="preserve"> </w:t>
+      </w:r>
+      <w:r>
+        <w:rPr>
+          <w:rFonts w:hint="default"/>
+          <w:b/>
+          <w:bCs/>
+          <w:lang w:val="en-US"/>
+        </w:rPr>
+        <w:t>Email</w:t>
+      </w:r>
+      <w:r>
+        <w:rPr>
+          <w:rFonts w:hint="default"/>
+          <w:lang w:val="en-US"/>
+        </w:rPr>
+        <w:t xml:space="preserve">: </w:t>
+      </w:r>
+      <w:r>
+        <w:rPr>
+          <w:rFonts w:hint="default"/>
+          <w:lang w:val="en-US"/>
+        </w:rPr>
+        <w:fldChar w:fldCharType="begin"/>
+      </w:r>
+      <w:r>
+        <w:rPr>
+          <w:rFonts w:hint="default"/>
+          <w:lang w:val="en-US"/>
+        </w:rPr>
+        <w:instrText xml:space="preserve"> HYPERLINK "mailto:yousef.mo.belal@gmail.com" </w:instrText>
+      </w:r>
+      <w:r>
+        <w:rPr>
+          <w:rFonts w:hint="default"/>
+          <w:lang w:val="en-US"/>
+        </w:rPr>
+        <w:fldChar w:fldCharType="separate"/>
+      </w:r>
+      <w:r>
+        <w:rPr>
+          <w:rStyle w:val="6"/>
+          <w:rFonts w:hint="default"/>
+          <w:lang w:val="en-US"/>
+        </w:rPr>
+        <w:t>yousefmobelal@gmail.com</w:t>
+      </w:r>
+      <w:r>
+        <w:rPr>
+          <w:rFonts w:hint="default"/>
+          <w:lang w:val="en-US"/>
+        </w:rPr>
+        <w:fldChar w:fldCharType="end"/>
+      </w:r>
+      <w:r>
+        <w:rPr>
+          <w:rFonts w:hint="default"/>
+          <w:lang w:val="en-US"/>
+        </w:rPr>
+        <w:t xml:space="preserve"> </w:t>
+      </w:r>
+      <w:r>
+        <w:rPr>
+          <w:rFonts w:hint="default"/>
+          <w:b/>
+          <w:bCs/>
+          <w:lang w:val="en-US"/>
+        </w:rPr>
+        <w:t>|</w:t>
+      </w:r>
+      <w:r>
+        <w:rPr>
+          <w:rFonts w:hint="default"/>
+          <w:lang w:val="en-US"/>
+        </w:rPr>
+        <w:t xml:space="preserve"> </w:t>
+      </w:r>
+      <w:r>
+        <w:rPr>
+          <w:rFonts w:hint="default"/>
+          <w:b/>
+          <w:bCs/>
+          <w:lang w:val="en-US"/>
+        </w:rPr>
+        <w:t>Phone</w:t>
+      </w:r>
+      <w:r>
+        <w:rPr>
+          <w:rFonts w:hint="default"/>
+          <w:lang w:val="en-US"/>
+        </w:rPr>
+        <w:t>: (+20) 1020913878</w:t>
+      </w:r>
+    </w:p>
+    <w:p>
+      <w:pPr>
         <w:spacing w:line="240" w:lineRule="auto"/>
         <w:jc w:val="center"/>
         <w:rPr>
           <w:rFonts w:hint="default"/>
-          <w:sz w:val="28"/>
-          <w:szCs w:val="28"/>
-          <w:lang w:val="en-US"/>
-        </w:rPr>
-      </w:pPr>
-      <w:r>
-        <w:rPr>
-          <w:rFonts w:hint="default"/>
-          <w:sz w:val="28"/>
-          <w:szCs w:val="28"/>
-          <w:lang w:val="en-US"/>
-        </w:rPr>
-        <w:t>Software Engineer (Full-Stack MEARN)</w:t>
-      </w:r>
-    </w:p>
-    <w:p>
-      <w:pPr>
-        <w:spacing w:line="240" w:lineRule="auto"/>
-        <w:jc w:val="center"/>
-        <w:rPr>
-          <w:rFonts w:hint="default"/>
-          <w:sz w:val="28"/>
-          <w:szCs w:val="28"/>
-          <w:lang w:val="en-US"/>
-        </w:rPr>
-      </w:pPr>
-    </w:p>
-    <w:p>
-      <w:pPr>
-        <w:spacing w:line="240" w:lineRule="auto"/>
-        <w:jc w:val="center"/>
-        <w:rPr>
-          <w:rFonts w:hint="default"/>
-          <w:lang w:val="en-US"/>
-        </w:rPr>
-      </w:pPr>
-      <w:r>
-        <w:rPr>
-          <w:rFonts w:hint="default"/>
-          <w:b/>
-          <w:bCs/>
-          <w:lang w:val="en-US"/>
-        </w:rPr>
-        <w:t>Address</w:t>
-      </w:r>
-      <w:r>
-        <w:rPr>
-          <w:rFonts w:hint="default"/>
-          <w:lang w:val="en-US"/>
-        </w:rPr>
-        <w:t xml:space="preserve">: El-Mansoura, Egypt </w:t>
+          <w:lang w:val="en-US"/>
+        </w:rPr>
+      </w:pPr>
+      <w:r>
+        <w:rPr>
+          <w:rFonts w:hint="default"/>
+          <w:b/>
+          <w:bCs/>
+          <w:lang w:val="en-US"/>
+        </w:rPr>
+        <w:t>GitHub</w:t>
+      </w:r>
+      <w:r>
+        <w:rPr>
+          <w:rFonts w:hint="default"/>
+          <w:lang w:val="en-US"/>
+        </w:rPr>
+        <w:t xml:space="preserve">: </w:t>
+      </w:r>
+      <w:r>
+        <w:rPr>
+          <w:rFonts w:hint="default"/>
+          <w:lang w:val="en-US"/>
+        </w:rPr>
+        <w:fldChar w:fldCharType="begin"/>
+      </w:r>
+      <w:r>
+        <w:rPr>
+          <w:rFonts w:hint="default"/>
+          <w:lang w:val="en-US"/>
+        </w:rPr>
+        <w:instrText xml:space="preserve"> HYPERLINK "https://github.com/yousefmobelal" </w:instrText>
+      </w:r>
+      <w:r>
+        <w:rPr>
+          <w:rFonts w:hint="default"/>
+          <w:lang w:val="en-US"/>
+        </w:rPr>
+        <w:fldChar w:fldCharType="separate"/>
+      </w:r>
+      <w:r>
+        <w:rPr>
+          <w:rStyle w:val="7"/>
+          <w:rFonts w:hint="default"/>
+          <w:lang w:val="en-US"/>
+        </w:rPr>
+        <w:t>yousefmobelal</w:t>
+      </w:r>
+      <w:r>
+        <w:rPr>
+          <w:rFonts w:hint="default"/>
+          <w:lang w:val="en-US"/>
+        </w:rPr>
+        <w:fldChar w:fldCharType="end"/>
+      </w:r>
+      <w:r>
+        <w:rPr>
+          <w:rFonts w:hint="default"/>
+          <w:lang w:val="en-US"/>
+        </w:rPr>
+        <w:t xml:space="preserve"> </w:t>
       </w:r>
       <w:r>
         <w:rPr>
@@ -122,7 +286,7 @@
           <w:bCs/>
           <w:lang w:val="en-US"/>
         </w:rPr>
-        <w:t>Email</w:t>
+        <w:t>LinkedIn</w:t>
       </w:r>
       <w:r>
         <w:rPr>
@@ -143,7 +307,7 @@
           <w:rFonts w:hint="default"/>
           <w:lang w:val="en-US"/>
         </w:rPr>
-        <w:instrText xml:space="preserve"> HYPERLINK "mailto:yousef.mo.belal@gmail.com" </w:instrText>
+        <w:instrText xml:space="preserve"> HYPERLINK "https://www.linkedin.com/in/yousef-mo-belal/" </w:instrText>
       </w:r>
       <w:r>
         <w:rPr>
@@ -154,11 +318,11 @@
       </w:r>
       <w:r>
         <w:rPr>
-          <w:rStyle w:val="5"/>
-          <w:rFonts w:hint="default"/>
-          <w:lang w:val="en-US"/>
-        </w:rPr>
-        <w:t>yousefmobelal@gmail.com</w:t>
+          <w:rStyle w:val="7"/>
+          <w:rFonts w:hint="default"/>
+          <w:lang w:val="en-US"/>
+        </w:rPr>
+        <w:t>yousef-mo-belal</w:t>
       </w:r>
       <w:r>
         <w:rPr>
@@ -167,192 +331,6 @@
         </w:rPr>
         <w:fldChar w:fldCharType="end"/>
       </w:r>
-      <w:r>
-        <w:rPr>
-          <w:rFonts w:hint="default"/>
-          <w:lang w:val="en-US"/>
-        </w:rPr>
-        <w:t xml:space="preserve"> </w:t>
-      </w:r>
-      <w:r>
-        <w:rPr>
-          <w:rFonts w:hint="default"/>
-          <w:b/>
-          <w:bCs/>
-          <w:lang w:val="en-US"/>
-        </w:rPr>
-        <w:t>|</w:t>
-      </w:r>
-      <w:r>
-        <w:rPr>
-          <w:rFonts w:hint="default"/>
-          <w:lang w:val="en-US"/>
-        </w:rPr>
-        <w:t xml:space="preserve"> </w:t>
-      </w:r>
-      <w:r>
-        <w:rPr>
-          <w:rFonts w:hint="default"/>
-          <w:b/>
-          <w:bCs/>
-          <w:lang w:val="en-US"/>
-        </w:rPr>
-        <w:t>Phone</w:t>
-      </w:r>
-      <w:r>
-        <w:rPr>
-          <w:rFonts w:hint="default"/>
-          <w:lang w:val="en-US"/>
-        </w:rPr>
-        <w:t>: (+20) 1020913878</w:t>
-      </w:r>
-    </w:p>
-    <w:p>
-      <w:pPr>
-        <w:spacing w:line="240" w:lineRule="auto"/>
-        <w:jc w:val="center"/>
-        <w:rPr>
-          <w:rFonts w:hint="default"/>
-          <w:lang w:val="en-US"/>
-        </w:rPr>
-      </w:pPr>
-      <w:r>
-        <w:rPr>
-          <w:rFonts w:hint="default"/>
-          <w:b/>
-          <w:bCs/>
-          <w:lang w:val="en-US"/>
-        </w:rPr>
-        <w:t>GitHub</w:t>
-      </w:r>
-      <w:r>
-        <w:rPr>
-          <w:rFonts w:hint="default"/>
-          <w:lang w:val="en-US"/>
-        </w:rPr>
-        <w:t xml:space="preserve">: </w:t>
-      </w:r>
-      <w:r>
-        <w:rPr>
-          <w:rFonts w:hint="default"/>
-          <w:lang w:val="en-US"/>
-        </w:rPr>
-        <w:fldChar w:fldCharType="begin"/>
-      </w:r>
-      <w:r>
-        <w:rPr>
-          <w:rFonts w:hint="default"/>
-          <w:lang w:val="en-US"/>
-        </w:rPr>
-        <w:instrText xml:space="preserve"> HYPERLINK "https://github.com/yousefmobelal" </w:instrText>
-      </w:r>
-      <w:r>
-        <w:rPr>
-          <w:rFonts w:hint="default"/>
-          <w:lang w:val="en-US"/>
-        </w:rPr>
-        <w:fldChar w:fldCharType="separate"/>
-      </w:r>
-      <w:r>
-        <w:rPr>
-          <w:rStyle w:val="6"/>
-          <w:rFonts w:hint="default"/>
-          <w:lang w:val="en-US"/>
-        </w:rPr>
-        <w:t>yousefmobelal</w:t>
-      </w:r>
-      <w:r>
-        <w:rPr>
-          <w:rFonts w:hint="default"/>
-          <w:lang w:val="en-US"/>
-        </w:rPr>
-        <w:fldChar w:fldCharType="end"/>
-      </w:r>
-      <w:r>
-        <w:rPr>
-          <w:rFonts w:hint="default"/>
-          <w:lang w:val="en-US"/>
-        </w:rPr>
-        <w:t xml:space="preserve"> </w:t>
-      </w:r>
-      <w:r>
-        <w:rPr>
-          <w:rFonts w:hint="default"/>
-          <w:b/>
-          <w:bCs/>
-          <w:lang w:val="en-US"/>
-        </w:rPr>
-        <w:t>|</w:t>
-      </w:r>
-      <w:r>
-        <w:rPr>
-          <w:rFonts w:hint="default"/>
-          <w:lang w:val="en-US"/>
-        </w:rPr>
-        <w:t xml:space="preserve"> </w:t>
-      </w:r>
-      <w:r>
-        <w:rPr>
-          <w:rFonts w:hint="default"/>
-          <w:b/>
-          <w:bCs/>
-          <w:lang w:val="en-US"/>
-        </w:rPr>
-        <w:t>LinkedIn</w:t>
-      </w:r>
-      <w:r>
-        <w:rPr>
-          <w:rFonts w:hint="default"/>
-          <w:lang w:val="en-US"/>
-        </w:rPr>
-        <w:t xml:space="preserve">: </w:t>
-      </w:r>
-      <w:r>
-        <w:rPr>
-          <w:rFonts w:hint="default"/>
-          <w:lang w:val="en-US"/>
-        </w:rPr>
-        <w:fldChar w:fldCharType="begin"/>
-      </w:r>
-      <w:r>
-        <w:rPr>
-          <w:rFonts w:hint="default"/>
-          <w:lang w:val="en-US"/>
-        </w:rPr>
-        <w:instrText xml:space="preserve"> HYPERLINK "https://www.linkedin.com/in/yousef-mo-belal/" </w:instrText>
-      </w:r>
-      <w:r>
-        <w:rPr>
-          <w:rFonts w:hint="default"/>
-          <w:lang w:val="en-US"/>
-        </w:rPr>
-        <w:fldChar w:fldCharType="separate"/>
-      </w:r>
-      <w:r>
-        <w:rPr>
-          <w:rStyle w:val="6"/>
-          <w:rFonts w:hint="default"/>
-          <w:lang w:val="en-US"/>
-        </w:rPr>
-        <w:t>yousef-mo-belal</w:t>
-      </w:r>
-      <w:r>
-        <w:rPr>
-          <w:rFonts w:hint="default"/>
-          <w:lang w:val="en-US"/>
-        </w:rPr>
-        <w:fldChar w:fldCharType="end"/>
-      </w:r>
-    </w:p>
-    <w:p>
-      <w:pPr>
-        <w:spacing w:line="240" w:lineRule="auto"/>
-        <w:jc w:val="both"/>
-        <w:rPr>
-          <w:rFonts w:hint="default"/>
-          <w:lang w:val="en-US"/>
-        </w:rPr>
-      </w:pPr>
     </w:p>
     <w:p>
       <w:pPr>
@@ -408,6 +386,7 @@
           <w:lang w:val="en-US"/>
         </w:rPr>
       </w:pPr>
+      <w:bookmarkStart w:id="0" w:name="_GoBack"/>
       <w:r>
         <w:rPr>
           <w:rFonts w:hint="default"/>
@@ -416,6 +395,7 @@
         <w:t>Full-Stack Developer focused on modern JavaScript/TypeScript stacks (MERN &amp; MEAN). Strong interest in backend development, with solid hands-on experience building secure and scalable web applications. Familiar with Clean Architecture, Test-Driven Development (TDD), and setting up basic CI/CD pipelines using GitHub Actions. Eager to design user-focused software that delivers real value while continuously improving technical skills and best practices.</w:t>
       </w:r>
     </w:p>
+    <w:bookmarkEnd w:id="0"/>
     <w:p>
       <w:pPr>
         <w:spacing w:line="240" w:lineRule="auto"/>
@@ -1138,7 +1118,6 @@
         <w:jc w:val="both"/>
         <w:rPr>
           <w:rFonts w:hint="default"/>
-          <w:color w:val="auto"/>
           <w:lang w:val="en-US"/>
         </w:rPr>
       </w:pPr>
@@ -1171,16 +1150,6 @@
     </w:p>
     <w:p>
       <w:pPr>
-        <w:spacing w:line="240" w:lineRule="auto"/>
-        <w:jc w:val="both"/>
-        <w:rPr>
-          <w:rFonts w:hint="default"/>
-          <w:lang w:val="en-US"/>
-        </w:rPr>
-      </w:pPr>
-    </w:p>
-    <w:p>
-      <w:pPr>
         <w:pBdr>
           <w:bottom w:val="single" w:color="auto" w:sz="4" w:space="0"/>
         </w:pBdr>
@@ -1300,7 +1269,7 @@
     </w:p>
     <w:p>
       <w:pPr>
-        <w:pStyle w:val="7"/>
+        <w:pStyle w:val="8"/>
         <w:keepNext w:val="0"/>
         <w:keepLines w:val="0"/>
         <w:widowControl/>
@@ -1327,7 +1296,7 @@
     </w:p>
     <w:p>
       <w:pPr>
-        <w:pStyle w:val="7"/>
+        <w:pStyle w:val="8"/>
         <w:keepNext w:val="0"/>
         <w:keepLines w:val="0"/>
         <w:widowControl/>
@@ -1355,7 +1324,7 @@
     </w:p>
     <w:p>
       <w:pPr>
-        <w:pStyle w:val="7"/>
+        <w:pStyle w:val="8"/>
         <w:keepNext w:val="0"/>
         <w:keepLines w:val="0"/>
         <w:widowControl/>
@@ -1382,7 +1351,265 @@
     </w:p>
     <w:p>
       <w:pPr>
-        <w:pStyle w:val="7"/>
+        <w:pStyle w:val="2"/>
+        <w:keepNext w:val="0"/>
+        <w:keepLines w:val="0"/>
+        <w:widowControl/>
+        <w:suppressLineNumbers w:val="0"/>
+        <w:pBdr>
+          <w:top w:val="none" w:color="auto" w:sz="0" w:space="0"/>
+          <w:left w:val="none" w:color="auto" w:sz="0" w:space="0"/>
+          <w:bottom w:val="none" w:color="auto" w:sz="0" w:space="0"/>
+          <w:right w:val="none" w:color="auto" w:sz="0" w:space="0"/>
+        </w:pBdr>
+        <w:shd w:val="clear" w:fill="FFFFFF"/>
+        <w:spacing w:before="0" w:beforeAutospacing="0" w:after="0" w:afterAutospacing="0" w:line="19" w:lineRule="atLeast"/>
+        <w:ind w:right="0" w:firstLine="360" w:firstLineChars="150"/>
+        <w:jc w:val="left"/>
+        <w:rPr>
+          <w:rFonts w:hint="default" w:asciiTheme="minorHAnsi" w:hAnsiTheme="minorHAnsi" w:eastAsiaTheme="minorEastAsia" w:cstheme="minorBidi"/>
+          <w:kern w:val="0"/>
+          <w:sz w:val="20"/>
+          <w:szCs w:val="20"/>
+          <w:lang w:val="en-US" w:eastAsia="zh-CN" w:bidi="ar-SA"/>
+        </w:rPr>
+      </w:pPr>
+      <w:r>
+        <w:rPr>
+          <w:rFonts w:hint="default" w:asciiTheme="minorHAnsi" w:hAnsiTheme="minorHAnsi" w:eastAsiaTheme="minorEastAsia" w:cstheme="minorBidi"/>
+          <w:b/>
+          <w:bCs/>
+          <w:kern w:val="0"/>
+          <w:sz w:val="24"/>
+          <w:szCs w:val="24"/>
+          <w:lang w:val="en-US" w:eastAsia="zh-CN" w:bidi="ar-SA"/>
+        </w:rPr>
+        <w:t>Examples</w:t>
+      </w:r>
+      <w:r>
+        <w:rPr>
+          <w:rFonts w:hint="default" w:asciiTheme="minorHAnsi" w:hAnsiTheme="minorHAnsi" w:eastAsiaTheme="minorEastAsia" w:cstheme="minorBidi"/>
+          <w:b w:val="0"/>
+          <w:bCs w:val="0"/>
+          <w:kern w:val="0"/>
+          <w:sz w:val="20"/>
+          <w:szCs w:val="20"/>
+          <w:lang w:val="en-US" w:eastAsia="zh-CN" w:bidi="ar-SA"/>
+        </w:rPr>
+        <w:t xml:space="preserve">: - </w:t>
+      </w:r>
+      <w:r>
+        <w:rPr>
+          <w:rFonts w:hint="default" w:asciiTheme="minorHAnsi" w:hAnsiTheme="minorHAnsi" w:eastAsiaTheme="minorEastAsia" w:cstheme="minorBidi"/>
+          <w:b/>
+          <w:bCs/>
+          <w:kern w:val="0"/>
+          <w:sz w:val="20"/>
+          <w:szCs w:val="20"/>
+          <w:lang w:val="en-US" w:eastAsia="zh-CN" w:bidi="ar-SA"/>
+        </w:rPr>
+        <w:t xml:space="preserve">coupon wafir - </w:t>
+      </w:r>
+      <w:r>
+        <w:rPr>
+          <w:rFonts w:hint="default" w:asciiTheme="minorHAnsi" w:hAnsiTheme="minorHAnsi" w:eastAsiaTheme="minorEastAsia" w:cstheme="minorBidi"/>
+          <w:b/>
+          <w:bCs/>
+          <w:kern w:val="0"/>
+          <w:sz w:val="20"/>
+          <w:szCs w:val="20"/>
+          <w:cs/>
+          <w:lang w:val="en-US" w:eastAsia="zh-CN" w:bidi="ar-SA"/>
+        </w:rPr>
+        <w:t>كوبون</w:t>
+      </w:r>
+      <w:r>
+        <w:rPr>
+          <w:rFonts w:hint="default" w:asciiTheme="minorHAnsi" w:hAnsiTheme="minorHAnsi" w:eastAsiaTheme="minorEastAsia" w:cstheme="minorBidi"/>
+          <w:b/>
+          <w:bCs/>
+          <w:kern w:val="0"/>
+          <w:sz w:val="20"/>
+          <w:szCs w:val="20"/>
+          <w:cs w:val="0"/>
+          <w:lang w:val="en-US" w:eastAsia="zh-CN" w:bidi="ar-SA"/>
+        </w:rPr>
+        <w:t xml:space="preserve"> </w:t>
+      </w:r>
+      <w:r>
+        <w:rPr>
+          <w:rFonts w:hint="default" w:asciiTheme="minorHAnsi" w:hAnsiTheme="minorHAnsi" w:eastAsiaTheme="minorEastAsia" w:cstheme="minorBidi"/>
+          <w:b/>
+          <w:bCs/>
+          <w:kern w:val="0"/>
+          <w:sz w:val="20"/>
+          <w:szCs w:val="20"/>
+          <w:cs/>
+          <w:lang w:val="en-US" w:eastAsia="zh-CN" w:bidi="ar-SA"/>
+        </w:rPr>
+        <w:t>وفر</w:t>
+      </w:r>
+      <w:r>
+        <w:rPr>
+          <w:rFonts w:hint="default" w:asciiTheme="minorHAnsi" w:hAnsiTheme="minorHAnsi" w:eastAsiaTheme="minorEastAsia" w:cstheme="minorBidi"/>
+          <w:b w:val="0"/>
+          <w:bCs w:val="0"/>
+          <w:kern w:val="0"/>
+          <w:sz w:val="20"/>
+          <w:szCs w:val="20"/>
+          <w:cs w:val="0"/>
+          <w:lang w:val="en-US" w:eastAsia="zh-CN" w:bidi="ar-SA"/>
+        </w:rPr>
+        <w:t xml:space="preserve"> </w:t>
+      </w:r>
+      <w:r>
+        <w:rPr>
+          <w:rFonts w:hint="default" w:asciiTheme="minorHAnsi" w:hAnsiTheme="minorHAnsi" w:eastAsiaTheme="minorEastAsia" w:cstheme="minorBidi"/>
+          <w:b w:val="0"/>
+          <w:bCs w:val="0"/>
+          <w:kern w:val="0"/>
+          <w:sz w:val="20"/>
+          <w:szCs w:val="20"/>
+          <w:lang w:val="en-US" w:eastAsia="zh-CN" w:bidi="ar-SA"/>
+        </w:rPr>
+        <w:drawing>
+          <wp:inline distT="0" distB="0" distL="114300" distR="114300">
+            <wp:extent cx="93345" cy="93345"/>
+            <wp:effectExtent l="0" t="0" r="1905" b="1905"/>
+            <wp:docPr id="4" name="Picture 4">
+              <a:hlinkClick xmlns:a="http://schemas.openxmlformats.org/drawingml/2006/main" r:id="rId4"/>
+            </wp:docPr>
+            <wp:cNvGraphicFramePr>
+              <a:graphicFrameLocks xmlns:a="http://schemas.openxmlformats.org/drawingml/2006/main" noChangeAspect="1"/>
+            </wp:cNvGraphicFramePr>
+            <a:graphic xmlns:a="http://schemas.openxmlformats.org/drawingml/2006/main">
+              <a:graphicData uri="http://schemas.openxmlformats.org/drawingml/2006/picture">
+                <pic:pic xmlns:pic="http://schemas.openxmlformats.org/drawingml/2006/picture">
+                  <pic:nvPicPr>
+                    <pic:cNvPr id="4" name="Picture 4"/>
+                    <pic:cNvPicPr>
+                      <a:picLocks noChangeAspect="1"/>
+                    </pic:cNvPicPr>
+                  </pic:nvPicPr>
+                  <pic:blipFill>
+                    <a:blip r:embed="rId5"/>
+                    <a:stretch>
+                      <a:fillRect/>
+                    </a:stretch>
+                  </pic:blipFill>
+                  <pic:spPr>
+                    <a:xfrm>
+                      <a:off x="0" y="0"/>
+                      <a:ext cx="93345" cy="93345"/>
+                    </a:xfrm>
+                    <a:prstGeom prst="rect">
+                      <a:avLst/>
+                    </a:prstGeom>
+                    <a:noFill/>
+                    <a:ln>
+                      <a:noFill/>
+                    </a:ln>
+                  </pic:spPr>
+                </pic:pic>
+              </a:graphicData>
+            </a:graphic>
+          </wp:inline>
+        </w:drawing>
+      </w:r>
+      <w:r>
+        <w:rPr>
+          <w:rFonts w:hint="default" w:asciiTheme="minorHAnsi" w:hAnsiTheme="minorHAnsi" w:eastAsiaTheme="minorEastAsia" w:cstheme="minorBidi"/>
+          <w:b w:val="0"/>
+          <w:bCs w:val="0"/>
+          <w:kern w:val="0"/>
+          <w:sz w:val="20"/>
+          <w:szCs w:val="20"/>
+          <w:lang w:val="en-US" w:eastAsia="zh-CN" w:bidi="ar-SA"/>
+        </w:rPr>
+        <w:t xml:space="preserve">   - </w:t>
+      </w:r>
+      <w:r>
+        <w:rPr>
+          <w:rFonts w:hint="default" w:asciiTheme="minorHAnsi" w:hAnsiTheme="minorHAnsi" w:eastAsiaTheme="minorEastAsia" w:cstheme="minorBidi"/>
+          <w:b/>
+          <w:bCs/>
+          <w:kern w:val="0"/>
+          <w:sz w:val="20"/>
+          <w:szCs w:val="20"/>
+          <w:lang w:val="en-US" w:eastAsia="zh-CN" w:bidi="ar-SA"/>
+        </w:rPr>
+        <w:t>Alain Factory For Healthy Water</w:t>
+      </w:r>
+      <w:r>
+        <w:rPr>
+          <w:rFonts w:hint="default" w:asciiTheme="minorHAnsi" w:hAnsiTheme="minorHAnsi" w:eastAsiaTheme="minorEastAsia" w:cstheme="minorBidi"/>
+          <w:b w:val="0"/>
+          <w:bCs w:val="0"/>
+          <w:kern w:val="0"/>
+          <w:sz w:val="20"/>
+          <w:szCs w:val="20"/>
+          <w:lang w:val="en-US" w:eastAsia="zh-CN" w:bidi="ar-SA"/>
+        </w:rPr>
+        <w:t xml:space="preserve"> </w:t>
+      </w:r>
+      <w:r>
+        <w:rPr>
+          <w:rFonts w:hint="default" w:asciiTheme="minorHAnsi" w:hAnsiTheme="minorHAnsi" w:eastAsiaTheme="minorEastAsia" w:cstheme="minorBidi"/>
+          <w:b w:val="0"/>
+          <w:bCs w:val="0"/>
+          <w:kern w:val="0"/>
+          <w:sz w:val="20"/>
+          <w:szCs w:val="20"/>
+          <w:lang w:val="en-US" w:eastAsia="zh-CN" w:bidi="ar-SA"/>
+        </w:rPr>
+        <w:drawing>
+          <wp:inline distT="0" distB="0" distL="114300" distR="114300">
+            <wp:extent cx="93345" cy="93345"/>
+            <wp:effectExtent l="0" t="0" r="1905" b="1905"/>
+            <wp:docPr id="5" name="Picture 5">
+              <a:hlinkClick xmlns:a="http://schemas.openxmlformats.org/drawingml/2006/main" r:id="rId6"/>
+            </wp:docPr>
+            <wp:cNvGraphicFramePr>
+              <a:graphicFrameLocks xmlns:a="http://schemas.openxmlformats.org/drawingml/2006/main" noChangeAspect="1"/>
+            </wp:cNvGraphicFramePr>
+            <a:graphic xmlns:a="http://schemas.openxmlformats.org/drawingml/2006/main">
+              <a:graphicData uri="http://schemas.openxmlformats.org/drawingml/2006/picture">
+                <pic:pic xmlns:pic="http://schemas.openxmlformats.org/drawingml/2006/picture">
+                  <pic:nvPicPr>
+                    <pic:cNvPr id="5" name="Picture 5"/>
+                    <pic:cNvPicPr>
+                      <a:picLocks noChangeAspect="1"/>
+                    </pic:cNvPicPr>
+                  </pic:nvPicPr>
+                  <pic:blipFill>
+                    <a:blip r:embed="rId5"/>
+                    <a:stretch>
+                      <a:fillRect/>
+                    </a:stretch>
+                  </pic:blipFill>
+                  <pic:spPr>
+                    <a:xfrm>
+                      <a:off x="0" y="0"/>
+                      <a:ext cx="93345" cy="93345"/>
+                    </a:xfrm>
+                    <a:prstGeom prst="rect">
+                      <a:avLst/>
+                    </a:prstGeom>
+                    <a:noFill/>
+                    <a:ln>
+                      <a:noFill/>
+                    </a:ln>
+                  </pic:spPr>
+                </pic:pic>
+              </a:graphicData>
+            </a:graphic>
+          </wp:inline>
+        </w:drawing>
+      </w:r>
+    </w:p>
+    <w:p>
+      <w:pPr>
+        <w:pStyle w:val="8"/>
         <w:keepNext w:val="0"/>
         <w:keepLines w:val="0"/>
         <w:widowControl/>
@@ -1409,7 +1636,7 @@
     </w:p>
     <w:p>
       <w:pPr>
-        <w:pStyle w:val="7"/>
+        <w:pStyle w:val="8"/>
         <w:keepNext w:val="0"/>
         <w:keepLines w:val="0"/>
         <w:widowControl/>
@@ -1454,7 +1681,7 @@
     </w:p>
     <w:p>
       <w:pPr>
-        <w:pStyle w:val="7"/>
+        <w:pStyle w:val="8"/>
         <w:keepNext w:val="0"/>
         <w:keepLines w:val="0"/>
         <w:widowControl/>
@@ -1486,7 +1713,7 @@
     </w:p>
     <w:p>
       <w:pPr>
-        <w:pStyle w:val="7"/>
+        <w:pStyle w:val="8"/>
         <w:keepNext w:val="0"/>
         <w:keepLines w:val="0"/>
         <w:widowControl/>
@@ -1513,7 +1740,7 @@
     </w:p>
     <w:p>
       <w:pPr>
-        <w:pStyle w:val="7"/>
+        <w:pStyle w:val="8"/>
         <w:keepNext w:val="0"/>
         <w:keepLines w:val="0"/>
         <w:widowControl/>
@@ -1540,7 +1767,7 @@
     </w:p>
     <w:p>
       <w:pPr>
-        <w:pStyle w:val="7"/>
+        <w:pStyle w:val="8"/>
         <w:keepNext w:val="0"/>
         <w:keepLines w:val="0"/>
         <w:widowControl/>
@@ -1562,7 +1789,29 @@
           <w:szCs w:val="20"/>
           <w:lang w:val="en-US" w:eastAsia="zh-CN" w:bidi="ar-SA"/>
         </w:rPr>
-        <w:t xml:space="preserve">- Client Demo: </w:t>
+        <w:t xml:space="preserve">- </w:t>
+      </w:r>
+      <w:r>
+        <w:rPr>
+          <w:rFonts w:hint="default" w:asciiTheme="minorHAnsi" w:hAnsiTheme="minorHAnsi" w:eastAsiaTheme="minorEastAsia" w:cstheme="minorBidi"/>
+          <w:b/>
+          <w:bCs/>
+          <w:kern w:val="0"/>
+          <w:sz w:val="20"/>
+          <w:szCs w:val="20"/>
+          <w:lang w:val="en-US" w:eastAsia="zh-CN" w:bidi="ar-SA"/>
+        </w:rPr>
+        <w:t>Client Demo</w:t>
+      </w:r>
+      <w:r>
+        <w:rPr>
+          <w:rFonts w:hint="default" w:asciiTheme="minorHAnsi" w:hAnsiTheme="minorHAnsi" w:eastAsiaTheme="minorEastAsia" w:cstheme="minorBidi"/>
+          <w:kern w:val="0"/>
+          <w:sz w:val="20"/>
+          <w:szCs w:val="20"/>
+          <w:lang w:val="en-US" w:eastAsia="zh-CN" w:bidi="ar-SA"/>
+        </w:rPr>
+        <w:t xml:space="preserve">: </w:t>
       </w:r>
       <w:r>
         <w:rPr>
@@ -1596,7 +1845,7 @@
       </w:r>
       <w:r>
         <w:rPr>
-          <w:rStyle w:val="5"/>
+          <w:rStyle w:val="6"/>
           <w:rFonts w:hint="default" w:asciiTheme="minorHAnsi" w:hAnsiTheme="minorHAnsi" w:eastAsiaTheme="minorEastAsia" w:cstheme="minorBidi"/>
           <w:kern w:val="0"/>
           <w:sz w:val="20"/>
@@ -1618,7 +1867,7 @@
     </w:p>
     <w:p>
       <w:pPr>
-        <w:pStyle w:val="7"/>
+        <w:pStyle w:val="8"/>
         <w:keepNext w:val="0"/>
         <w:keepLines w:val="0"/>
         <w:widowControl/>
@@ -1640,7 +1889,29 @@
           <w:szCs w:val="20"/>
           <w:lang w:val="en-US" w:eastAsia="zh-CN" w:bidi="ar-SA"/>
         </w:rPr>
-        <w:t xml:space="preserve">- Coach Demo: </w:t>
+        <w:t xml:space="preserve">- </w:t>
+      </w:r>
+      <w:r>
+        <w:rPr>
+          <w:rFonts w:hint="default" w:asciiTheme="minorHAnsi" w:hAnsiTheme="minorHAnsi" w:eastAsiaTheme="minorEastAsia" w:cstheme="minorBidi"/>
+          <w:b/>
+          <w:bCs/>
+          <w:kern w:val="0"/>
+          <w:sz w:val="20"/>
+          <w:szCs w:val="20"/>
+          <w:lang w:val="en-US" w:eastAsia="zh-CN" w:bidi="ar-SA"/>
+        </w:rPr>
+        <w:t>Coach Demo</w:t>
+      </w:r>
+      <w:r>
+        <w:rPr>
+          <w:rFonts w:hint="default" w:asciiTheme="minorHAnsi" w:hAnsiTheme="minorHAnsi" w:eastAsiaTheme="minorEastAsia" w:cstheme="minorBidi"/>
+          <w:kern w:val="0"/>
+          <w:sz w:val="20"/>
+          <w:szCs w:val="20"/>
+          <w:lang w:val="en-US" w:eastAsia="zh-CN" w:bidi="ar-SA"/>
+        </w:rPr>
+        <w:t xml:space="preserve">: </w:t>
       </w:r>
       <w:r>
         <w:rPr>
@@ -1674,7 +1945,7 @@
       </w:r>
       <w:r>
         <w:rPr>
-          <w:rStyle w:val="5"/>
+          <w:rStyle w:val="6"/>
           <w:rFonts w:hint="default" w:asciiTheme="minorHAnsi" w:hAnsiTheme="minorHAnsi" w:eastAsiaTheme="minorEastAsia" w:cstheme="minorBidi"/>
           <w:kern w:val="0"/>
           <w:sz w:val="20"/>
@@ -1696,7 +1967,7 @@
     </w:p>
     <w:p>
       <w:pPr>
-        <w:pStyle w:val="7"/>
+        <w:pStyle w:val="8"/>
         <w:keepNext w:val="0"/>
         <w:keepLines w:val="0"/>
         <w:widowControl/>
@@ -1723,7 +1994,307 @@
           <w:szCs w:val="20"/>
           <w:lang w:val="en-US" w:eastAsia="zh-CN" w:bidi="ar-SA"/>
         </w:rPr>
-        <w:t>Foodi</w:t>
+        <w:t>Foodi:</w:t>
+      </w:r>
+    </w:p>
+    <w:p>
+      <w:pPr>
+        <w:pStyle w:val="8"/>
+        <w:keepNext w:val="0"/>
+        <w:keepLines w:val="0"/>
+        <w:widowControl/>
+        <w:suppressLineNumbers w:val="0"/>
+        <w:spacing w:before="0" w:beforeAutospacing="0" w:after="0" w:afterAutospacing="0" w:line="240" w:lineRule="auto"/>
+        <w:ind w:left="100" w:hanging="100" w:hangingChars="50"/>
+        <w:rPr>
+          <w:rFonts w:hint="default" w:asciiTheme="minorHAnsi" w:hAnsiTheme="minorHAnsi" w:eastAsiaTheme="minorEastAsia" w:cstheme="minorBidi"/>
+          <w:kern w:val="0"/>
+          <w:sz w:val="20"/>
+          <w:szCs w:val="20"/>
+          <w:lang w:val="en-US" w:eastAsia="zh-CN" w:bidi="ar-SA"/>
+        </w:rPr>
+      </w:pPr>
+      <w:r>
+        <w:rPr>
+          <w:rFonts w:hint="default" w:asciiTheme="minorHAnsi" w:hAnsiTheme="minorHAnsi" w:eastAsiaTheme="minorEastAsia" w:cstheme="minorBidi"/>
+          <w:kern w:val="0"/>
+          <w:sz w:val="20"/>
+          <w:szCs w:val="20"/>
+          <w:lang w:val="en-US" w:eastAsia="zh-CN" w:bidi="ar-SA"/>
+        </w:rPr>
+        <w:t>- Built a responsive Angular application that displays nearby restaurants and their menus, allowing users</w:t>
+      </w:r>
+    </w:p>
+    <w:p>
+      <w:pPr>
+        <w:pStyle w:val="8"/>
+        <w:keepNext w:val="0"/>
+        <w:keepLines w:val="0"/>
+        <w:widowControl/>
+        <w:suppressLineNumbers w:val="0"/>
+        <w:spacing w:before="0" w:beforeAutospacing="0" w:after="0" w:afterAutospacing="0" w:line="240" w:lineRule="auto"/>
+        <w:rPr>
+          <w:rFonts w:hint="default" w:asciiTheme="minorHAnsi" w:hAnsiTheme="minorHAnsi" w:eastAsiaTheme="minorEastAsia" w:cstheme="minorBidi"/>
+          <w:kern w:val="0"/>
+          <w:sz w:val="20"/>
+          <w:szCs w:val="20"/>
+          <w:lang w:val="en-US" w:eastAsia="zh-CN" w:bidi="ar-SA"/>
+        </w:rPr>
+      </w:pPr>
+      <w:r>
+        <w:rPr>
+          <w:rFonts w:hint="default" w:asciiTheme="minorHAnsi" w:hAnsiTheme="minorHAnsi" w:eastAsiaTheme="minorEastAsia" w:cstheme="minorBidi"/>
+          <w:kern w:val="0"/>
+          <w:sz w:val="20"/>
+          <w:szCs w:val="20"/>
+          <w:lang w:val="en-US" w:eastAsia="zh-CN" w:bidi="ar-SA"/>
+        </w:rPr>
+        <w:t xml:space="preserve">  to browse dishes, view restaurant details, and add items to a shopping cart.</w:t>
+      </w:r>
+    </w:p>
+    <w:p>
+      <w:pPr>
+        <w:pStyle w:val="8"/>
+        <w:keepNext w:val="0"/>
+        <w:keepLines w:val="0"/>
+        <w:widowControl/>
+        <w:suppressLineNumbers w:val="0"/>
+        <w:spacing w:before="0" w:beforeAutospacing="0" w:after="0" w:afterAutospacing="0" w:line="240" w:lineRule="auto"/>
+        <w:rPr>
+          <w:rFonts w:hint="default" w:asciiTheme="minorHAnsi" w:hAnsiTheme="minorHAnsi" w:eastAsiaTheme="minorEastAsia" w:cstheme="minorBidi"/>
+          <w:kern w:val="0"/>
+          <w:sz w:val="20"/>
+          <w:szCs w:val="20"/>
+          <w:lang w:val="en-US" w:eastAsia="zh-CN" w:bidi="ar-SA"/>
+        </w:rPr>
+      </w:pPr>
+      <w:r>
+        <w:rPr>
+          <w:rFonts w:hint="default" w:asciiTheme="minorHAnsi" w:hAnsiTheme="minorHAnsi" w:eastAsiaTheme="minorEastAsia" w:cstheme="minorBidi"/>
+          <w:kern w:val="0"/>
+          <w:sz w:val="20"/>
+          <w:szCs w:val="20"/>
+          <w:lang w:val="en-US" w:eastAsia="zh-CN" w:bidi="ar-SA"/>
+        </w:rPr>
+        <w:t xml:space="preserve">- </w:t>
+      </w:r>
+      <w:r>
+        <w:rPr>
+          <w:rFonts w:hint="default" w:asciiTheme="minorHAnsi" w:hAnsiTheme="minorHAnsi" w:eastAsiaTheme="minorEastAsia" w:cstheme="minorBidi"/>
+          <w:b/>
+          <w:bCs/>
+          <w:kern w:val="0"/>
+          <w:sz w:val="20"/>
+          <w:szCs w:val="20"/>
+          <w:lang w:val="en-US" w:eastAsia="zh-CN" w:bidi="ar-SA"/>
+        </w:rPr>
+        <w:t>Client website (Angular)</w:t>
+      </w:r>
+      <w:r>
+        <w:rPr>
+          <w:rFonts w:hint="default" w:asciiTheme="minorHAnsi" w:hAnsiTheme="minorHAnsi" w:eastAsiaTheme="minorEastAsia" w:cstheme="minorBidi"/>
+          <w:kern w:val="0"/>
+          <w:sz w:val="20"/>
+          <w:szCs w:val="20"/>
+          <w:lang w:val="en-US" w:eastAsia="zh-CN" w:bidi="ar-SA"/>
+        </w:rPr>
+        <w:t xml:space="preserve">: </w:t>
+      </w:r>
+      <w:r>
+        <w:rPr>
+          <w:rFonts w:hint="default" w:asciiTheme="minorHAnsi" w:hAnsiTheme="minorHAnsi" w:eastAsiaTheme="minorEastAsia" w:cstheme="minorBidi"/>
+          <w:kern w:val="0"/>
+          <w:sz w:val="20"/>
+          <w:szCs w:val="20"/>
+          <w:lang w:val="en-US" w:eastAsia="zh-CN" w:bidi="ar-SA"/>
+        </w:rPr>
+        <w:fldChar w:fldCharType="begin"/>
+      </w:r>
+      <w:r>
+        <w:rPr>
+          <w:rFonts w:hint="default" w:asciiTheme="minorHAnsi" w:hAnsiTheme="minorHAnsi" w:eastAsiaTheme="minorEastAsia" w:cstheme="minorBidi"/>
+          <w:kern w:val="0"/>
+          <w:sz w:val="20"/>
+          <w:szCs w:val="20"/>
+          <w:lang w:val="en-US" w:eastAsia="zh-CN" w:bidi="ar-SA"/>
+        </w:rPr>
+        <w:instrText xml:space="preserve"> HYPERLINK "https://foodi-jet.vercel.app/" </w:instrText>
+      </w:r>
+      <w:r>
+        <w:rPr>
+          <w:rFonts w:hint="default" w:asciiTheme="minorHAnsi" w:hAnsiTheme="minorHAnsi" w:eastAsiaTheme="minorEastAsia" w:cstheme="minorBidi"/>
+          <w:kern w:val="0"/>
+          <w:sz w:val="20"/>
+          <w:szCs w:val="20"/>
+          <w:lang w:val="en-US" w:eastAsia="zh-CN" w:bidi="ar-SA"/>
+        </w:rPr>
+        <w:fldChar w:fldCharType="separate"/>
+      </w:r>
+      <w:r>
+        <w:rPr>
+          <w:rStyle w:val="7"/>
+          <w:rFonts w:hint="default" w:asciiTheme="minorHAnsi" w:hAnsiTheme="minorHAnsi" w:eastAsiaTheme="minorEastAsia" w:cstheme="minorBidi"/>
+          <w:kern w:val="0"/>
+          <w:sz w:val="20"/>
+          <w:szCs w:val="20"/>
+          <w:lang w:val="en-US" w:eastAsia="zh-CN" w:bidi="ar-SA"/>
+        </w:rPr>
+        <w:t>Foodi Website</w:t>
+      </w:r>
+      <w:r>
+        <w:rPr>
+          <w:rFonts w:hint="default" w:asciiTheme="minorHAnsi" w:hAnsiTheme="minorHAnsi" w:eastAsiaTheme="minorEastAsia" w:cstheme="minorBidi"/>
+          <w:kern w:val="0"/>
+          <w:sz w:val="20"/>
+          <w:szCs w:val="20"/>
+          <w:lang w:val="en-US" w:eastAsia="zh-CN" w:bidi="ar-SA"/>
+        </w:rPr>
+        <w:fldChar w:fldCharType="end"/>
+      </w:r>
+    </w:p>
+    <w:p>
+      <w:pPr>
+        <w:pStyle w:val="8"/>
+        <w:keepNext w:val="0"/>
+        <w:keepLines w:val="0"/>
+        <w:widowControl/>
+        <w:suppressLineNumbers w:val="0"/>
+        <w:spacing w:before="0" w:beforeAutospacing="0" w:after="0" w:afterAutospacing="0" w:line="240" w:lineRule="auto"/>
+        <w:rPr>
+          <w:rFonts w:hint="default" w:asciiTheme="minorHAnsi" w:hAnsiTheme="minorHAnsi" w:eastAsiaTheme="minorEastAsia" w:cstheme="minorBidi"/>
+          <w:kern w:val="0"/>
+          <w:sz w:val="20"/>
+          <w:szCs w:val="20"/>
+          <w:lang w:val="en-US" w:eastAsia="zh-CN" w:bidi="ar-SA"/>
+        </w:rPr>
+      </w:pPr>
+      <w:r>
+        <w:rPr>
+          <w:rFonts w:hint="default" w:asciiTheme="minorHAnsi" w:hAnsiTheme="minorHAnsi" w:eastAsiaTheme="minorEastAsia" w:cstheme="minorBidi"/>
+          <w:kern w:val="0"/>
+          <w:sz w:val="20"/>
+          <w:szCs w:val="20"/>
+          <w:lang w:val="en-US" w:eastAsia="zh-CN" w:bidi="ar-SA"/>
+        </w:rPr>
+        <w:t xml:space="preserve">- </w:t>
+      </w:r>
+      <w:r>
+        <w:rPr>
+          <w:rFonts w:hint="default" w:asciiTheme="minorHAnsi" w:hAnsiTheme="minorHAnsi" w:eastAsiaTheme="minorEastAsia" w:cstheme="minorBidi"/>
+          <w:b/>
+          <w:bCs/>
+          <w:kern w:val="0"/>
+          <w:sz w:val="20"/>
+          <w:szCs w:val="20"/>
+          <w:lang w:val="en-US" w:eastAsia="zh-CN" w:bidi="ar-SA"/>
+        </w:rPr>
+        <w:t>Backend</w:t>
+      </w:r>
+      <w:r>
+        <w:rPr>
+          <w:rFonts w:hint="default" w:asciiTheme="minorHAnsi" w:hAnsiTheme="minorHAnsi" w:eastAsiaTheme="minorEastAsia" w:cstheme="minorBidi"/>
+          <w:kern w:val="0"/>
+          <w:sz w:val="20"/>
+          <w:szCs w:val="20"/>
+          <w:lang w:val="en-US" w:eastAsia="zh-CN" w:bidi="ar-SA"/>
+        </w:rPr>
+        <w:t xml:space="preserve">: </w:t>
+      </w:r>
+      <w:r>
+        <w:rPr>
+          <w:rFonts w:hint="default" w:asciiTheme="minorHAnsi" w:hAnsiTheme="minorHAnsi" w:eastAsiaTheme="minorEastAsia" w:cstheme="minorBidi"/>
+          <w:kern w:val="0"/>
+          <w:sz w:val="20"/>
+          <w:szCs w:val="20"/>
+          <w:lang w:val="en-US" w:eastAsia="zh-CN" w:bidi="ar-SA"/>
+        </w:rPr>
+        <w:fldChar w:fldCharType="begin"/>
+      </w:r>
+      <w:r>
+        <w:rPr>
+          <w:rFonts w:hint="default" w:asciiTheme="minorHAnsi" w:hAnsiTheme="minorHAnsi" w:eastAsiaTheme="minorEastAsia" w:cstheme="minorBidi"/>
+          <w:kern w:val="0"/>
+          <w:sz w:val="20"/>
+          <w:szCs w:val="20"/>
+          <w:lang w:val="en-US" w:eastAsia="zh-CN" w:bidi="ar-SA"/>
+        </w:rPr>
+        <w:instrText xml:space="preserve"> HYPERLINK "https://github.com/yousefmobelal/Foodi-Backend" </w:instrText>
+      </w:r>
+      <w:r>
+        <w:rPr>
+          <w:rFonts w:hint="default" w:asciiTheme="minorHAnsi" w:hAnsiTheme="minorHAnsi" w:eastAsiaTheme="minorEastAsia" w:cstheme="minorBidi"/>
+          <w:kern w:val="0"/>
+          <w:sz w:val="20"/>
+          <w:szCs w:val="20"/>
+          <w:lang w:val="en-US" w:eastAsia="zh-CN" w:bidi="ar-SA"/>
+        </w:rPr>
+        <w:fldChar w:fldCharType="separate"/>
+      </w:r>
+      <w:r>
+        <w:rPr>
+          <w:rStyle w:val="7"/>
+          <w:rFonts w:hint="default" w:asciiTheme="minorHAnsi" w:hAnsiTheme="minorHAnsi" w:eastAsiaTheme="minorEastAsia" w:cstheme="minorBidi"/>
+          <w:kern w:val="0"/>
+          <w:sz w:val="20"/>
+          <w:szCs w:val="20"/>
+          <w:lang w:val="en-US" w:eastAsia="zh-CN" w:bidi="ar-SA"/>
+        </w:rPr>
+        <w:t>Foodi Backend</w:t>
+      </w:r>
+      <w:r>
+        <w:rPr>
+          <w:rFonts w:hint="default" w:asciiTheme="minorHAnsi" w:hAnsiTheme="minorHAnsi" w:eastAsiaTheme="minorEastAsia" w:cstheme="minorBidi"/>
+          <w:kern w:val="0"/>
+          <w:sz w:val="20"/>
+          <w:szCs w:val="20"/>
+          <w:lang w:val="en-US" w:eastAsia="zh-CN" w:bidi="ar-SA"/>
+        </w:rPr>
+        <w:fldChar w:fldCharType="end"/>
+      </w:r>
+    </w:p>
+    <w:p>
+      <w:pPr>
+        <w:pStyle w:val="8"/>
+        <w:keepNext w:val="0"/>
+        <w:keepLines w:val="0"/>
+        <w:widowControl/>
+        <w:suppressLineNumbers w:val="0"/>
+        <w:spacing w:before="85" w:beforeLines="23" w:beforeAutospacing="0" w:after="125" w:afterLines="34" w:afterAutospacing="0" w:line="240" w:lineRule="auto"/>
+        <w:jc w:val="left"/>
+        <w:rPr>
+          <w:rFonts w:hint="default" w:asciiTheme="minorHAnsi" w:hAnsiTheme="minorHAnsi" w:eastAsiaTheme="minorEastAsia" w:cstheme="minorBidi"/>
+          <w:b/>
+          <w:bCs/>
+          <w:kern w:val="0"/>
+          <w:sz w:val="20"/>
+          <w:szCs w:val="20"/>
+          <w:lang w:val="en-US" w:eastAsia="zh-CN" w:bidi="ar-SA"/>
+        </w:rPr>
+      </w:pPr>
+      <w:r>
+        <w:rPr>
+          <w:rFonts w:hint="default" w:asciiTheme="minorHAnsi" w:hAnsiTheme="minorHAnsi" w:eastAsiaTheme="minorEastAsia" w:cstheme="minorBidi"/>
+          <w:b/>
+          <w:bCs/>
+          <w:kern w:val="0"/>
+          <w:sz w:val="20"/>
+          <w:szCs w:val="20"/>
+          <w:lang w:val="en-US" w:eastAsia="zh-CN" w:bidi="ar-SA"/>
+        </w:rPr>
+        <w:t>Hotel Booking</w:t>
+      </w:r>
+      <w:r>
+        <w:rPr>
+          <w:rFonts w:hint="cs" w:asciiTheme="minorHAnsi" w:hAnsiTheme="minorHAnsi" w:eastAsiaTheme="minorEastAsia" w:cstheme="minorBidi"/>
+          <w:b/>
+          <w:bCs/>
+          <w:kern w:val="0"/>
+          <w:sz w:val="20"/>
+          <w:szCs w:val="20"/>
+          <w:rtl/>
+          <w:lang w:val="en-US" w:eastAsia="zh-CN" w:bidi="ar-EG"/>
+        </w:rPr>
+        <w:t xml:space="preserve"> </w:t>
       </w:r>
       <w:r>
         <w:rPr>
@@ -1737,19 +2308,19 @@
           <wp:inline distT="0" distB="0" distL="0" distR="0">
             <wp:extent cx="64770" cy="64770"/>
             <wp:effectExtent l="0" t="0" r="11430" b="11430"/>
-            <wp:docPr id="1" name="Image 30">
-              <a:hlinkClick xmlns:a="http://schemas.openxmlformats.org/drawingml/2006/main" r:id="rId4"/>
+            <wp:docPr id="30" name="Image 30">
+              <a:hlinkClick xmlns:a="http://schemas.openxmlformats.org/drawingml/2006/main" r:id="rId7"/>
             </wp:docPr>
             <wp:cNvGraphicFramePr/>
             <a:graphic xmlns:a="http://schemas.openxmlformats.org/drawingml/2006/main">
               <a:graphicData uri="http://schemas.openxmlformats.org/drawingml/2006/picture">
                 <pic:pic xmlns:pic="http://schemas.openxmlformats.org/drawingml/2006/picture">
                   <pic:nvPicPr>
-                    <pic:cNvPr id="1" name="Image 30"/>
+                    <pic:cNvPr id="30" name="Image 30"/>
                     <pic:cNvPicPr/>
                   </pic:nvPicPr>
                   <pic:blipFill>
-                    <a:blip r:embed="rId5" cstate="print"/>
+                    <a:blip r:embed="rId8" cstate="print"/>
                     <a:stretch>
                       <a:fillRect/>
                     </a:stretch>
@@ -1784,7 +2355,7 @@
     </w:p>
     <w:p>
       <w:pPr>
-        <w:pStyle w:val="7"/>
+        <w:pStyle w:val="8"/>
         <w:keepNext w:val="0"/>
         <w:keepLines w:val="0"/>
         <w:widowControl/>
@@ -1807,12 +2378,12 @@
           <w:szCs w:val="20"/>
           <w:lang w:val="en-US" w:eastAsia="zh-CN" w:bidi="ar-SA"/>
         </w:rPr>
-        <w:t>- Built a responsive Angular application that displays nearby restaurants and their menus, allowing users</w:t>
-      </w:r>
-    </w:p>
-    <w:p>
-      <w:pPr>
-        <w:pStyle w:val="7"/>
+        <w:t>- Hotel booking platform that allows users to search for hotels, view room availability, and reserve rooms securely.</w:t>
+      </w:r>
+    </w:p>
+    <w:p>
+      <w:pPr>
+        <w:pStyle w:val="8"/>
         <w:keepNext w:val="0"/>
         <w:keepLines w:val="0"/>
         <w:widowControl/>
@@ -1834,170 +2405,12 @@
           <w:szCs w:val="20"/>
           <w:lang w:val="en-US" w:eastAsia="zh-CN" w:bidi="ar-SA"/>
         </w:rPr>
-        <w:t xml:space="preserve">  to browse dishes, view restaurant details, and add items to a shopping cart.</w:t>
-      </w:r>
-    </w:p>
-    <w:p>
-      <w:pPr>
-        <w:pStyle w:val="7"/>
-        <w:keepNext w:val="0"/>
-        <w:keepLines w:val="0"/>
-        <w:widowControl/>
-        <w:suppressLineNumbers w:val="0"/>
-        <w:spacing w:before="85" w:beforeLines="23" w:beforeAutospacing="0" w:after="125" w:afterLines="34" w:afterAutospacing="0" w:line="240" w:lineRule="auto"/>
-        <w:jc w:val="left"/>
-        <w:rPr>
-          <w:rFonts w:hint="default" w:asciiTheme="minorHAnsi" w:hAnsiTheme="minorHAnsi" w:eastAsiaTheme="minorEastAsia" w:cstheme="minorBidi"/>
-          <w:b/>
-          <w:bCs/>
-          <w:kern w:val="0"/>
-          <w:sz w:val="20"/>
-          <w:szCs w:val="20"/>
-          <w:lang w:val="en-US" w:eastAsia="zh-CN" w:bidi="ar-SA"/>
-        </w:rPr>
-      </w:pPr>
-      <w:bookmarkStart w:id="0" w:name="_GoBack"/>
-      <w:r>
-        <w:rPr>
-          <w:rFonts w:hint="default" w:asciiTheme="minorHAnsi" w:hAnsiTheme="minorHAnsi" w:eastAsiaTheme="minorEastAsia" w:cstheme="minorBidi"/>
-          <w:b/>
-          <w:bCs/>
-          <w:kern w:val="0"/>
-          <w:sz w:val="20"/>
-          <w:szCs w:val="20"/>
-          <w:lang w:val="en-US" w:eastAsia="zh-CN" w:bidi="ar-SA"/>
-        </w:rPr>
-        <w:t>Hotel Booking</w:t>
-      </w:r>
-      <w:r>
-        <w:rPr>
-          <w:rFonts w:hint="cs" w:asciiTheme="minorHAnsi" w:hAnsiTheme="minorHAnsi" w:eastAsiaTheme="minorEastAsia" w:cstheme="minorBidi"/>
-          <w:b/>
-          <w:bCs/>
-          <w:kern w:val="0"/>
-          <w:sz w:val="20"/>
-          <w:szCs w:val="20"/>
-          <w:rtl/>
-          <w:lang w:val="en-US" w:eastAsia="zh-CN" w:bidi="ar-EG"/>
-        </w:rPr>
-        <w:t xml:space="preserve"> </w:t>
-      </w:r>
-      <w:r>
-        <w:rPr>
-          <w:rFonts w:hint="default" w:ascii="Times New Roman" w:hAnsi="Times New Roman" w:cs="Times New Roman"/>
-          <w:spacing w:val="-7"/>
-          <w:position w:val="1"/>
-          <w:sz w:val="19"/>
-          <w:szCs w:val="19"/>
-        </w:rPr>
-        <w:drawing>
-          <wp:inline distT="0" distB="0" distL="0" distR="0">
-            <wp:extent cx="64770" cy="64770"/>
-            <wp:effectExtent l="0" t="0" r="11430" b="11430"/>
-            <wp:docPr id="30" name="Image 30">
-              <a:hlinkClick xmlns:a="http://schemas.openxmlformats.org/drawingml/2006/main" r:id="rId6"/>
-            </wp:docPr>
-            <wp:cNvGraphicFramePr/>
-            <a:graphic xmlns:a="http://schemas.openxmlformats.org/drawingml/2006/main">
-              <a:graphicData uri="http://schemas.openxmlformats.org/drawingml/2006/picture">
-                <pic:pic xmlns:pic="http://schemas.openxmlformats.org/drawingml/2006/picture">
-                  <pic:nvPicPr>
-                    <pic:cNvPr id="30" name="Image 30"/>
-                    <pic:cNvPicPr/>
-                  </pic:nvPicPr>
-                  <pic:blipFill>
-                    <a:blip r:embed="rId5" cstate="print"/>
-                    <a:stretch>
-                      <a:fillRect/>
-                    </a:stretch>
-                  </pic:blipFill>
-                  <pic:spPr>
-                    <a:xfrm>
-                      <a:off x="0" y="0"/>
-                      <a:ext cx="65360" cy="65360"/>
-                    </a:xfrm>
-                    <a:prstGeom prst="rect">
-                      <a:avLst/>
-                    </a:prstGeom>
-                  </pic:spPr>
-                </pic:pic>
-              </a:graphicData>
-            </a:graphic>
-          </wp:inline>
-        </w:drawing>
-      </w:r>
-      <w:r>
-        <w:rPr>
-          <w:rFonts w:hint="default" w:asciiTheme="minorHAnsi" w:hAnsiTheme="minorHAnsi" w:eastAsiaTheme="minorEastAsia" w:cstheme="minorBidi"/>
-          <w:b/>
-          <w:bCs/>
-          <w:kern w:val="0"/>
-          <w:sz w:val="20"/>
-          <w:szCs w:val="20"/>
-          <w:lang w:val="en-US" w:eastAsia="zh-CN" w:bidi="ar-SA"/>
-        </w:rPr>
-        <w:t>:</w:t>
-      </w:r>
-    </w:p>
-    <w:bookmarkEnd w:id="0"/>
-    <w:p>
-      <w:pPr>
-        <w:pStyle w:val="7"/>
-        <w:keepNext w:val="0"/>
-        <w:keepLines w:val="0"/>
-        <w:widowControl/>
-        <w:suppressLineNumbers w:val="0"/>
-        <w:spacing w:before="0" w:beforeAutospacing="0" w:after="0" w:afterAutospacing="0" w:line="240" w:lineRule="auto"/>
-        <w:ind w:left="100" w:hanging="100" w:hangingChars="50"/>
-        <w:rPr>
-          <w:rFonts w:hint="default" w:asciiTheme="minorHAnsi" w:hAnsiTheme="minorHAnsi" w:eastAsiaTheme="minorEastAsia" w:cstheme="minorBidi"/>
-          <w:kern w:val="0"/>
-          <w:sz w:val="20"/>
-          <w:szCs w:val="20"/>
-          <w:lang w:val="en-US" w:eastAsia="zh-CN" w:bidi="ar-SA"/>
-        </w:rPr>
-      </w:pPr>
-      <w:r>
-        <w:rPr>
-          <w:rFonts w:hint="default" w:asciiTheme="minorHAnsi" w:hAnsiTheme="minorHAnsi" w:eastAsiaTheme="minorEastAsia" w:cstheme="minorBidi"/>
-          <w:kern w:val="0"/>
-          <w:sz w:val="20"/>
-          <w:szCs w:val="20"/>
-          <w:lang w:val="en-US" w:eastAsia="zh-CN" w:bidi="ar-SA"/>
-        </w:rPr>
-        <w:t>- Hotel booking platform that allows users to search for hotels, view room availability, and reserve rooms securely.</w:t>
-      </w:r>
-    </w:p>
-    <w:p>
-      <w:pPr>
-        <w:pStyle w:val="7"/>
-        <w:keepNext w:val="0"/>
-        <w:keepLines w:val="0"/>
-        <w:widowControl/>
-        <w:suppressLineNumbers w:val="0"/>
-        <w:spacing w:before="0" w:beforeAutospacing="0" w:after="0" w:afterAutospacing="0" w:line="240" w:lineRule="auto"/>
-        <w:rPr>
-          <w:rFonts w:hint="default" w:asciiTheme="minorHAnsi" w:hAnsiTheme="minorHAnsi" w:eastAsiaTheme="minorEastAsia" w:cstheme="minorBidi"/>
-          <w:kern w:val="0"/>
-          <w:sz w:val="20"/>
-          <w:szCs w:val="20"/>
-          <w:lang w:val="en-US" w:eastAsia="zh-CN" w:bidi="ar-SA"/>
-        </w:rPr>
-      </w:pPr>
-      <w:r>
-        <w:rPr>
-          <w:rFonts w:hint="default" w:asciiTheme="minorHAnsi" w:hAnsiTheme="minorHAnsi" w:eastAsiaTheme="minorEastAsia" w:cstheme="minorBidi"/>
-          <w:kern w:val="0"/>
-          <w:sz w:val="20"/>
-          <w:szCs w:val="20"/>
-          <w:lang w:val="en-US" w:eastAsia="zh-CN" w:bidi="ar-SA"/>
-        </w:rPr>
         <w:t>- It’s designed to power both web and mobile clients, handling everything from user authentication to booking management.</w:t>
       </w:r>
     </w:p>
     <w:p>
       <w:pPr>
-        <w:pStyle w:val="7"/>
+        <w:pStyle w:val="8"/>
         <w:keepNext w:val="0"/>
         <w:keepLines w:val="0"/>
         <w:widowControl/>
@@ -2035,7 +2448,7 @@
     </w:p>
     <w:p>
       <w:pPr>
-        <w:pStyle w:val="7"/>
+        <w:pStyle w:val="8"/>
         <w:keepNext w:val="0"/>
         <w:keepLines w:val="0"/>
         <w:widowControl/>
@@ -2081,7 +2494,7 @@
     </w:p>
     <w:p>
       <w:pPr>
-        <w:pStyle w:val="7"/>
+        <w:pStyle w:val="8"/>
         <w:keepNext w:val="0"/>
         <w:keepLines w:val="0"/>
         <w:widowControl/>
@@ -2130,7 +2543,7 @@
     </w:p>
     <w:p>
       <w:pPr>
-        <w:pStyle w:val="7"/>
+        <w:pStyle w:val="8"/>
         <w:keepNext w:val="0"/>
         <w:keepLines w:val="0"/>
         <w:widowControl/>
@@ -2179,7 +2592,7 @@
     </w:p>
     <w:p>
       <w:pPr>
-        <w:pStyle w:val="7"/>
+        <w:pStyle w:val="8"/>
         <w:keepNext w:val="0"/>
         <w:keepLines w:val="0"/>
         <w:widowControl/>
@@ -2228,7 +2641,7 @@
     </w:p>
     <w:p>
       <w:pPr>
-        <w:pStyle w:val="7"/>
+        <w:pStyle w:val="8"/>
         <w:keepNext w:val="0"/>
         <w:keepLines w:val="0"/>
         <w:widowControl/>
@@ -2277,7 +2690,7 @@
     </w:p>
     <w:p>
       <w:pPr>
-        <w:pStyle w:val="7"/>
+        <w:pStyle w:val="8"/>
         <w:keepNext w:val="0"/>
         <w:keepLines w:val="0"/>
         <w:widowControl/>
@@ -2326,7 +2739,7 @@
     </w:p>
     <w:p>
       <w:pPr>
-        <w:pStyle w:val="7"/>
+        <w:pStyle w:val="8"/>
         <w:keepNext w:val="0"/>
         <w:keepLines w:val="0"/>
         <w:widowControl/>
@@ -2658,12 +3071,31 @@
       <w:lang w:val="en-US" w:eastAsia="zh-CN" w:bidi="ar-SA"/>
     </w:rPr>
   </w:style>
-  <w:style w:type="character" w:default="1" w:styleId="2">
+  <w:style w:type="paragraph" w:styleId="2">
+    <w:name w:val="heading 1"/>
+    <w:next w:val="1"/>
+    <w:qFormat/>
+    <w:uiPriority w:val="0"/>
+    <w:pPr>
+      <w:spacing w:before="0" w:beforeAutospacing="1" w:after="0" w:afterAutospacing="1"/>
+      <w:jc w:val="left"/>
+    </w:pPr>
+    <w:rPr>
+      <w:rFonts w:hint="eastAsia" w:ascii="SimSun" w:hAnsi="SimSun" w:eastAsia="SimSun" w:cs="SimSun"/>
+      <w:b/>
+      <w:bCs/>
+      <w:kern w:val="44"/>
+      <w:sz w:val="48"/>
+      <w:szCs w:val="48"/>
+      <w:lang w:val="en-US" w:eastAsia="zh-CN" w:bidi="ar"/>
+    </w:rPr>
+  </w:style>
+  <w:style w:type="character" w:default="1" w:styleId="3">
     <w:name w:val="Default Paragraph Font"/>
     <w:semiHidden/>
     <w:uiPriority w:val="0"/>
   </w:style>
-  <w:style w:type="table" w:default="1" w:styleId="3">
+  <w:style w:type="table" w:default="1" w:styleId="4">
     <w:name w:val="Normal Table"/>
     <w:semiHidden/>
     <w:uiPriority w:val="0"/>
@@ -2676,7 +3108,7 @@
       </w:tblCellMar>
     </w:tblPr>
   </w:style>
-  <w:style w:type="paragraph" w:styleId="4">
+  <w:style w:type="paragraph" w:styleId="5">
     <w:name w:val="Body Text"/>
     <w:basedOn w:val="1"/>
     <w:qFormat/>
@@ -2691,9 +3123,9 @@
       <w:lang w:val="en-US" w:eastAsia="en-US" w:bidi="ar-SA"/>
     </w:rPr>
   </w:style>
-  <w:style w:type="character" w:styleId="5">
+  <w:style w:type="character" w:styleId="6">
     <w:name w:val="FollowedHyperlink"/>
-    <w:basedOn w:val="2"/>
+    <w:basedOn w:val="3"/>
     <w:qFormat/>
     <w:uiPriority w:val="0"/>
     <w:rPr>
@@ -2701,9 +3133,9 @@
       <w:u w:val="single"/>
     </w:rPr>
   </w:style>
-  <w:style w:type="character" w:styleId="6">
+  <w:style w:type="character" w:styleId="7">
     <w:name w:val="Hyperlink"/>
-    <w:basedOn w:val="2"/>
+    <w:basedOn w:val="3"/>
     <w:qFormat/>
     <w:uiPriority w:val="0"/>
     <w:rPr>
@@ -2711,7 +3143,7 @@
       <w:u w:val="single"/>
     </w:rPr>
   </w:style>
-  <w:style w:type="paragraph" w:styleId="7">
+  <w:style w:type="paragraph" w:styleId="8">
     <w:name w:val="Normal (Web)"/>
     <w:qFormat/>
     <w:uiPriority w:val="0"/>
@@ -2728,9 +3160,9 @@
       <w:lang w:val="en-US" w:eastAsia="zh-CN" w:bidi="ar"/>
     </w:rPr>
   </w:style>
-  <w:style w:type="character" w:styleId="8">
+  <w:style w:type="character" w:styleId="9">
     <w:name w:val="Strong"/>
-    <w:basedOn w:val="2"/>
+    <w:basedOn w:val="3"/>
     <w:qFormat/>
     <w:uiPriority w:val="0"/>
     <w:rPr>

</xml_diff>